<commit_message>
Docs : documents du TP nommés dans le déroulé
Suite du renommage en tp-doc : le déroulé désigne les documents Word
de l'exercice comme « documents Word du TP » et « 3 DOCX du TP ».
Les mentions de l'exercice Sami restent, alignées sur les titres des
slides 66 et 72. Pagination inchangée (5 pages, rendu LibreOffice).
</commit_message>
<xml_diff>
--- a/livrables-IGPDE-2026-102846/Formateur/documents-administratifs-igpde/Derped-deroule-pedagogique-102846-v2.docx
+++ b/livrables-IGPDE-2026-102846/Formateur/documents-administratifs-igpde/Derped-deroule-pedagogique-102846-v2.docx
@@ -772,7 +772,7 @@
                 <w:lang w:val="fr-FR" w:eastAsia="fr-FR"/>
                 <w:szCs w:val="21"/>
               </w:rPr>
-              <w:t>Support PPTX 138 slides, documents Word Sami, site d’exercice Easy Checks, grille XLSX, exemples de publications sociales.</w:t>
+              <w:t>Support PPTX 138 slides, documents Word du TP, site d’exercice Easy Checks, grille XLSX, exemples de publications sociales.</w:t>
             </w:r>
           </w:p>
         </w:tc>
@@ -1621,7 +1621,7 @@
                 <w:rFonts w:ascii="Marianne" w:hAnsi="Marianne"/>
                 <w:sz w:val="18"/>
               </w:rPr>
-              <w:t>Support PPTX slides 54 à 73, 3 DOCX Sami (inaccessible, aide à la correction, accessible), fiches mémo Word et LibreOffice Writer (PDF), Microsoft Word ou LibreOffice Writer, casque audio avec prise jack, vérificateur d'accessibilité Word.</w:t>
+              <w:t>Support PPTX slides 54 à 73, 3 DOCX du TP (inaccessible, aide à la correction, accessible), fiches mémo Word et LibreOffice Writer (PDF), Microsoft Word ou LibreOffice Writer, casque audio avec prise jack, vérificateur d'accessibilité Word.</w:t>
             </w:r>
           </w:p>
         </w:tc>

</xml_diff>